<commit_message>
Update logo animation control and history section stability
</commit_message>
<xml_diff>
--- a/files/Kennyresume_2026.docx
+++ b/files/Kennyresume_2026.docx
@@ -39,17 +39,19 @@
             <w:pPr>
               <w:spacing w:after="20" w:line="247" w:lineRule="auto"/>
               <w:rPr>
-                <w:lang w:eastAsia="ko-KR"/>
-              </w:rPr>
-            </w:pPr>
-            <w:r>
-              <w:rPr>
+                <w:rFonts w:hint="eastAsia"/>
+                <w:lang w:eastAsia="ko-KR"/>
+              </w:rPr>
+            </w:pPr>
+            <w:r>
+              <w:rPr>
+                <w:rFonts w:hint="eastAsia"/>
                 <w:b/>
                 <w:color w:val="1F4D78"/>
                 <w:sz w:val="46"/>
                 <w:lang w:eastAsia="ko-KR"/>
               </w:rPr>
-              <w:t>김경민 경력소개서</w:t>
+              <w:t>Kenny Kim</w:t>
             </w:r>
           </w:p>
           <w:p>
@@ -301,7 +303,7 @@
                 <w:noProof/>
               </w:rPr>
               <w:drawing>
-                <wp:inline distT="0" distB="0" distL="0" distR="0" wp14:anchorId="46E6FC21" wp14:editId="2023EC62">
+                <wp:inline distT="0" distB="0" distL="0" distR="0" wp14:anchorId="46E6FC21" wp14:editId="788B335C">
                   <wp:extent cx="862853" cy="1111250"/>
                   <wp:effectExtent l="0" t="0" r="0" b="0"/>
                   <wp:docPr id="1" name="Picture 1"/>
@@ -324,7 +326,7 @@
                         <pic:spPr>
                           <a:xfrm>
                             <a:off x="0" y="0"/>
-                            <a:ext cx="871303" cy="1122133"/>
+                            <a:ext cx="862853" cy="1111250"/>
                           </a:xfrm>
                           <a:prstGeom prst="rect">
                             <a:avLst/>
@@ -476,9 +478,28 @@
           <w:p>
             <w:pPr>
               <w:spacing w:after="0" w:line="247" w:lineRule="auto"/>
-            </w:pPr>
-            <w:r>
-              <w:t>UI/UX기획</w:t>
+              <w:rPr>
+                <w:lang w:eastAsia="ko-KR"/>
+              </w:rPr>
+            </w:pPr>
+            <w:r>
+              <w:rPr>
+                <w:lang w:eastAsia="ko-KR"/>
+              </w:rPr>
+              <w:t>UI/UX</w:t>
+            </w:r>
+            <w:r>
+              <w:rPr>
+                <w:rFonts w:hint="eastAsia"/>
+                <w:lang w:eastAsia="ko-KR"/>
+              </w:rPr>
+              <w:t>디자인/PM/PL/</w:t>
+            </w:r>
+            <w:r>
+              <w:rPr>
+                <w:lang w:eastAsia="ko-KR"/>
+              </w:rPr>
+              <w:t>기획</w:t>
             </w:r>
           </w:p>
         </w:tc>
@@ -654,7 +675,19 @@
           <w:p>
             <w:pPr>
               <w:spacing w:after="0" w:line="247" w:lineRule="auto"/>
-            </w:pPr>
+              <w:rPr>
+                <w:rFonts w:hint="eastAsia"/>
+                <w:lang w:eastAsia="ko-KR"/>
+              </w:rPr>
+            </w:pPr>
+            <w:hyperlink r:id="rId9" w:history="1">
+              <w:r>
+                <w:rPr>
+                  <w:rStyle w:val="aff1"/>
+                </w:rPr>
+                <w:t>https://rza.co.kr/</w:t>
+              </w:r>
+            </w:hyperlink>
           </w:p>
         </w:tc>
         <w:tc>
@@ -679,6 +712,7 @@
             <w:pPr>
               <w:spacing w:after="0" w:line="247" w:lineRule="auto"/>
             </w:pPr>
+            <w:proofErr w:type="spellStart"/>
             <w:r>
               <w:rPr>
                 <w:b/>
@@ -686,6 +720,7 @@
               </w:rPr>
               <w:t>출근가능지역</w:t>
             </w:r>
+            <w:proofErr w:type="spellEnd"/>
           </w:p>
         </w:tc>
         <w:tc>
@@ -1416,31 +1451,33 @@
     </w:p>
     <w:tbl>
       <w:tblPr>
-        <w:tblW w:w="15070" w:type="dxa"/>
+        <w:tblW w:w="15065" w:type="dxa"/>
         <w:jc w:val="center"/>
         <w:tblLayout w:type="fixed"/>
         <w:tblLook w:val="04A0" w:firstRow="1" w:lastRow="0" w:firstColumn="1" w:lastColumn="0" w:noHBand="0" w:noVBand="1"/>
       </w:tblPr>
       <w:tblGrid>
-        <w:gridCol w:w="2300"/>
-        <w:gridCol w:w="4700"/>
-        <w:gridCol w:w="2000"/>
-        <w:gridCol w:w="1700"/>
-        <w:gridCol w:w="4370"/>
+        <w:gridCol w:w="2403"/>
+        <w:gridCol w:w="4536"/>
+        <w:gridCol w:w="567"/>
+        <w:gridCol w:w="2835"/>
+        <w:gridCol w:w="1417"/>
+        <w:gridCol w:w="3307"/>
       </w:tblGrid>
       <w:tr>
         <w:trPr>
+          <w:trHeight w:val="283"/>
           <w:tblHeader/>
           <w:jc w:val="center"/>
         </w:trPr>
         <w:tc>
           <w:tcPr>
-            <w:tcW w:w="2300" w:type="dxa"/>
-            <w:tcBorders>
-              <w:top w:val="single" w:sz="4" w:space="0" w:color="C9D3E0"/>
-              <w:left w:val="single" w:sz="4" w:space="0" w:color="C9D3E0"/>
-              <w:bottom w:val="single" w:sz="4" w:space="0" w:color="C9D3E0"/>
-              <w:right w:val="single" w:sz="4" w:space="0" w:color="C9D3E0"/>
+            <w:tcW w:w="2403" w:type="dxa"/>
+            <w:tcBorders>
+              <w:top w:val="single" w:sz="4" w:space="0" w:color="B8CCE4" w:themeColor="accent1" w:themeTint="66"/>
+              <w:left w:val="single" w:sz="4" w:space="0" w:color="B8CCE4" w:themeColor="accent1" w:themeTint="66"/>
+              <w:bottom w:val="single" w:sz="4" w:space="0" w:color="B8CCE4" w:themeColor="accent1" w:themeTint="66"/>
+              <w:right w:val="single" w:sz="4" w:space="0" w:color="B8CCE4" w:themeColor="accent1" w:themeTint="66"/>
             </w:tcBorders>
             <w:shd w:val="clear" w:color="auto" w:fill="E8EEF5"/>
             <w:tcMar>
@@ -1456,6 +1493,7 @@
               <w:spacing w:after="0" w:line="247" w:lineRule="auto"/>
               <w:jc w:val="center"/>
             </w:pPr>
+            <w:proofErr w:type="spellStart"/>
             <w:r>
               <w:rPr>
                 <w:b/>
@@ -1464,16 +1502,17 @@
               </w:rPr>
               <w:t>기간</w:t>
             </w:r>
-          </w:p>
-        </w:tc>
-        <w:tc>
-          <w:tcPr>
-            <w:tcW w:w="4700" w:type="dxa"/>
-            <w:tcBorders>
-              <w:top w:val="single" w:sz="4" w:space="0" w:color="C9D3E0"/>
-              <w:left w:val="single" w:sz="4" w:space="0" w:color="C9D3E0"/>
-              <w:bottom w:val="single" w:sz="4" w:space="0" w:color="C9D3E0"/>
-              <w:right w:val="single" w:sz="4" w:space="0" w:color="C9D3E0"/>
+            <w:proofErr w:type="spellEnd"/>
+          </w:p>
+        </w:tc>
+        <w:tc>
+          <w:tcPr>
+            <w:tcW w:w="4536" w:type="dxa"/>
+            <w:tcBorders>
+              <w:top w:val="single" w:sz="4" w:space="0" w:color="B8CCE4" w:themeColor="accent1" w:themeTint="66"/>
+              <w:left w:val="single" w:sz="4" w:space="0" w:color="B8CCE4" w:themeColor="accent1" w:themeTint="66"/>
+              <w:bottom w:val="single" w:sz="4" w:space="0" w:color="B8CCE4" w:themeColor="accent1" w:themeTint="66"/>
+              <w:right w:val="single" w:sz="4" w:space="0" w:color="B8CCE4" w:themeColor="accent1" w:themeTint="66"/>
             </w:tcBorders>
             <w:shd w:val="clear" w:color="auto" w:fill="E8EEF5"/>
             <w:tcMar>
@@ -1489,6 +1528,7 @@
               <w:spacing w:after="0" w:line="247" w:lineRule="auto"/>
               <w:jc w:val="center"/>
             </w:pPr>
+            <w:proofErr w:type="spellStart"/>
             <w:r>
               <w:rPr>
                 <w:b/>
@@ -1497,49 +1537,38 @@
               </w:rPr>
               <w:t>회사명</w:t>
             </w:r>
-          </w:p>
-        </w:tc>
-        <w:tc>
-          <w:tcPr>
-            <w:tcW w:w="2000" w:type="dxa"/>
-            <w:tcBorders>
-              <w:top w:val="single" w:sz="4" w:space="0" w:color="C9D3E0"/>
-              <w:left w:val="single" w:sz="4" w:space="0" w:color="C9D3E0"/>
-              <w:bottom w:val="single" w:sz="4" w:space="0" w:color="C9D3E0"/>
-              <w:right w:val="single" w:sz="4" w:space="0" w:color="C9D3E0"/>
-            </w:tcBorders>
-            <w:shd w:val="clear" w:color="auto" w:fill="E8EEF5"/>
-            <w:tcMar>
-              <w:top w:w="70" w:type="dxa"/>
-              <w:left w:w="90" w:type="dxa"/>
-              <w:bottom w:w="70" w:type="dxa"/>
-              <w:right w:w="90" w:type="dxa"/>
-            </w:tcMar>
-            <w:vAlign w:val="center"/>
+            <w:proofErr w:type="spellEnd"/>
+          </w:p>
+        </w:tc>
+        <w:tc>
+          <w:tcPr>
+            <w:tcW w:w="567" w:type="dxa"/>
+            <w:tcBorders>
+              <w:left w:val="single" w:sz="4" w:space="0" w:color="B8CCE4" w:themeColor="accent1" w:themeTint="66"/>
+              <w:right w:val="single" w:sz="4" w:space="0" w:color="B8CCE4" w:themeColor="accent1" w:themeTint="66"/>
+            </w:tcBorders>
+            <w:shd w:val="clear" w:color="auto" w:fill="FFFFFF" w:themeFill="background1"/>
           </w:tcPr>
           <w:p>
             <w:pPr>
               <w:spacing w:after="0" w:line="247" w:lineRule="auto"/>
               <w:jc w:val="center"/>
-            </w:pPr>
-            <w:r>
               <w:rPr>
                 <w:b/>
                 <w:color w:val="1F4D78"/>
                 <w:sz w:val="16"/>
               </w:rPr>
-              <w:t>사용 기술</w:t>
-            </w:r>
-          </w:p>
-        </w:tc>
-        <w:tc>
-          <w:tcPr>
-            <w:tcW w:w="1700" w:type="dxa"/>
-            <w:tcBorders>
-              <w:top w:val="single" w:sz="4" w:space="0" w:color="C9D3E0"/>
-              <w:left w:val="single" w:sz="4" w:space="0" w:color="C9D3E0"/>
-              <w:bottom w:val="single" w:sz="4" w:space="0" w:color="C9D3E0"/>
-              <w:right w:val="single" w:sz="4" w:space="0" w:color="C9D3E0"/>
+            </w:pPr>
+          </w:p>
+        </w:tc>
+        <w:tc>
+          <w:tcPr>
+            <w:tcW w:w="2835" w:type="dxa"/>
+            <w:tcBorders>
+              <w:top w:val="single" w:sz="4" w:space="0" w:color="B8CCE4" w:themeColor="accent1" w:themeTint="66"/>
+              <w:left w:val="single" w:sz="4" w:space="0" w:color="B8CCE4" w:themeColor="accent1" w:themeTint="66"/>
+              <w:bottom w:val="single" w:sz="4" w:space="0" w:color="B8CCE4" w:themeColor="accent1" w:themeTint="66"/>
+              <w:right w:val="single" w:sz="4" w:space="0" w:color="B8CCE4" w:themeColor="accent1" w:themeTint="66"/>
             </w:tcBorders>
             <w:shd w:val="clear" w:color="auto" w:fill="E8EEF5"/>
             <w:tcMar>
@@ -1555,62 +1584,138 @@
               <w:spacing w:after="0" w:line="247" w:lineRule="auto"/>
               <w:jc w:val="center"/>
             </w:pPr>
+            <w:proofErr w:type="spellStart"/>
             <w:r>
               <w:rPr>
                 <w:b/>
                 <w:color w:val="1F4D78"/>
                 <w:sz w:val="16"/>
               </w:rPr>
-              <w:t>숙련도</w:t>
-            </w:r>
-          </w:p>
-        </w:tc>
-        <w:tc>
-          <w:tcPr>
-            <w:tcW w:w="4370" w:type="dxa"/>
-            <w:tcBorders>
-              <w:top w:val="single" w:sz="4" w:space="0" w:color="C9D3E0"/>
-              <w:left w:val="single" w:sz="4" w:space="0" w:color="C9D3E0"/>
-              <w:bottom w:val="single" w:sz="4" w:space="0" w:color="C9D3E0"/>
-              <w:right w:val="single" w:sz="4" w:space="0" w:color="C9D3E0"/>
-            </w:tcBorders>
-            <w:shd w:val="clear" w:color="auto" w:fill="E8EEF5"/>
-            <w:tcMar>
-              <w:top w:w="70" w:type="dxa"/>
-              <w:left w:w="90" w:type="dxa"/>
-              <w:bottom w:w="70" w:type="dxa"/>
-              <w:right w:w="90" w:type="dxa"/>
-            </w:tcMar>
-            <w:vAlign w:val="center"/>
-          </w:tcPr>
-          <w:p>
-            <w:pPr>
-              <w:spacing w:after="0" w:line="247" w:lineRule="auto"/>
-              <w:jc w:val="center"/>
-            </w:pPr>
+              <w:t>사용</w:t>
+            </w:r>
+            <w:proofErr w:type="spellEnd"/>
             <w:r>
               <w:rPr>
                 <w:b/>
                 <w:color w:val="1F4D78"/>
                 <w:sz w:val="16"/>
               </w:rPr>
-              <w:t>자격증/취득일</w:t>
-            </w:r>
+              <w:t xml:space="preserve"> </w:t>
+            </w:r>
+            <w:proofErr w:type="spellStart"/>
+            <w:r>
+              <w:rPr>
+                <w:b/>
+                <w:color w:val="1F4D78"/>
+                <w:sz w:val="16"/>
+              </w:rPr>
+              <w:t>기술</w:t>
+            </w:r>
+            <w:proofErr w:type="spellEnd"/>
+          </w:p>
+        </w:tc>
+        <w:tc>
+          <w:tcPr>
+            <w:tcW w:w="1417" w:type="dxa"/>
+            <w:tcBorders>
+              <w:top w:val="single" w:sz="4" w:space="0" w:color="B8CCE4" w:themeColor="accent1" w:themeTint="66"/>
+              <w:left w:val="single" w:sz="4" w:space="0" w:color="B8CCE4" w:themeColor="accent1" w:themeTint="66"/>
+              <w:bottom w:val="single" w:sz="4" w:space="0" w:color="B8CCE4" w:themeColor="accent1" w:themeTint="66"/>
+              <w:right w:val="single" w:sz="4" w:space="0" w:color="B8CCE4" w:themeColor="accent1" w:themeTint="66"/>
+            </w:tcBorders>
+            <w:shd w:val="clear" w:color="auto" w:fill="E8EEF5"/>
+            <w:tcMar>
+              <w:top w:w="70" w:type="dxa"/>
+              <w:left w:w="90" w:type="dxa"/>
+              <w:bottom w:w="70" w:type="dxa"/>
+              <w:right w:w="90" w:type="dxa"/>
+            </w:tcMar>
+            <w:vAlign w:val="center"/>
+          </w:tcPr>
+          <w:p>
+            <w:pPr>
+              <w:spacing w:after="0" w:line="247" w:lineRule="auto"/>
+              <w:jc w:val="center"/>
+            </w:pPr>
+            <w:proofErr w:type="spellStart"/>
+            <w:r>
+              <w:rPr>
+                <w:b/>
+                <w:color w:val="1F4D78"/>
+                <w:sz w:val="16"/>
+              </w:rPr>
+              <w:t>숙련도</w:t>
+            </w:r>
+            <w:proofErr w:type="spellEnd"/>
+          </w:p>
+        </w:tc>
+        <w:tc>
+          <w:tcPr>
+            <w:tcW w:w="3307" w:type="dxa"/>
+            <w:tcBorders>
+              <w:top w:val="single" w:sz="4" w:space="0" w:color="B8CCE4" w:themeColor="accent1" w:themeTint="66"/>
+              <w:left w:val="single" w:sz="4" w:space="0" w:color="B8CCE4" w:themeColor="accent1" w:themeTint="66"/>
+              <w:bottom w:val="single" w:sz="4" w:space="0" w:color="B8CCE4" w:themeColor="accent1" w:themeTint="66"/>
+              <w:right w:val="single" w:sz="4" w:space="0" w:color="B8CCE4" w:themeColor="accent1" w:themeTint="66"/>
+            </w:tcBorders>
+            <w:shd w:val="clear" w:color="auto" w:fill="E8EEF5"/>
+            <w:tcMar>
+              <w:top w:w="70" w:type="dxa"/>
+              <w:left w:w="90" w:type="dxa"/>
+              <w:bottom w:w="70" w:type="dxa"/>
+              <w:right w:w="90" w:type="dxa"/>
+            </w:tcMar>
+            <w:vAlign w:val="center"/>
+          </w:tcPr>
+          <w:p>
+            <w:pPr>
+              <w:spacing w:after="0" w:line="247" w:lineRule="auto"/>
+              <w:jc w:val="center"/>
+            </w:pPr>
+            <w:proofErr w:type="spellStart"/>
+            <w:r>
+              <w:rPr>
+                <w:b/>
+                <w:color w:val="1F4D78"/>
+                <w:sz w:val="16"/>
+              </w:rPr>
+              <w:t>자격증</w:t>
+            </w:r>
+            <w:proofErr w:type="spellEnd"/>
+            <w:r>
+              <w:rPr>
+                <w:b/>
+                <w:color w:val="1F4D78"/>
+                <w:sz w:val="16"/>
+              </w:rPr>
+              <w:t>/</w:t>
+            </w:r>
+            <w:proofErr w:type="spellStart"/>
+            <w:r>
+              <w:rPr>
+                <w:b/>
+                <w:color w:val="1F4D78"/>
+                <w:sz w:val="16"/>
+              </w:rPr>
+              <w:t>취득일</w:t>
+            </w:r>
+            <w:proofErr w:type="spellEnd"/>
           </w:p>
         </w:tc>
       </w:tr>
       <w:tr>
         <w:trPr>
+          <w:trHeight w:val="313"/>
           <w:jc w:val="center"/>
         </w:trPr>
         <w:tc>
           <w:tcPr>
-            <w:tcW w:w="2300" w:type="dxa"/>
-            <w:tcBorders>
-              <w:top w:val="single" w:sz="4" w:space="0" w:color="C9D3E0"/>
-              <w:left w:val="single" w:sz="4" w:space="0" w:color="C9D3E0"/>
-              <w:bottom w:val="single" w:sz="4" w:space="0" w:color="C9D3E0"/>
-              <w:right w:val="single" w:sz="4" w:space="0" w:color="C9D3E0"/>
+            <w:tcW w:w="2403" w:type="dxa"/>
+            <w:tcBorders>
+              <w:top w:val="single" w:sz="4" w:space="0" w:color="B8CCE4" w:themeColor="accent1" w:themeTint="66"/>
+              <w:left w:val="single" w:sz="4" w:space="0" w:color="B8CCE4" w:themeColor="accent1" w:themeTint="66"/>
+              <w:bottom w:val="single" w:sz="4" w:space="0" w:color="B8CCE4" w:themeColor="accent1" w:themeTint="66"/>
+              <w:right w:val="single" w:sz="4" w:space="0" w:color="B8CCE4" w:themeColor="accent1" w:themeTint="66"/>
             </w:tcBorders>
             <w:tcMar>
               <w:top w:w="70" w:type="dxa"/>
@@ -1625,7 +1730,6 @@
               <w:spacing w:after="0" w:line="247" w:lineRule="auto"/>
               <w:jc w:val="center"/>
               <w:rPr>
-                <w:rFonts w:hint="eastAsia"/>
                 <w:lang w:eastAsia="ko-KR"/>
               </w:rPr>
             </w:pPr>
@@ -1647,12 +1751,12 @@
         </w:tc>
         <w:tc>
           <w:tcPr>
-            <w:tcW w:w="4700" w:type="dxa"/>
-            <w:tcBorders>
-              <w:top w:val="single" w:sz="4" w:space="0" w:color="C9D3E0"/>
-              <w:left w:val="single" w:sz="4" w:space="0" w:color="C9D3E0"/>
-              <w:bottom w:val="single" w:sz="4" w:space="0" w:color="C9D3E0"/>
-              <w:right w:val="single" w:sz="4" w:space="0" w:color="C9D3E0"/>
+            <w:tcW w:w="4536" w:type="dxa"/>
+            <w:tcBorders>
+              <w:top w:val="single" w:sz="4" w:space="0" w:color="B8CCE4" w:themeColor="accent1" w:themeTint="66"/>
+              <w:left w:val="single" w:sz="4" w:space="0" w:color="B8CCE4" w:themeColor="accent1" w:themeTint="66"/>
+              <w:bottom w:val="single" w:sz="4" w:space="0" w:color="B8CCE4" w:themeColor="accent1" w:themeTint="66"/>
+              <w:right w:val="single" w:sz="4" w:space="0" w:color="B8CCE4" w:themeColor="accent1" w:themeTint="66"/>
             </w:tcBorders>
             <w:tcMar>
               <w:top w:w="70" w:type="dxa"/>
@@ -1684,12 +1788,30 @@
         </w:tc>
         <w:tc>
           <w:tcPr>
-            <w:tcW w:w="2000" w:type="dxa"/>
-            <w:tcBorders>
-              <w:top w:val="single" w:sz="4" w:space="0" w:color="C9D3E0"/>
-              <w:left w:val="single" w:sz="4" w:space="0" w:color="C9D3E0"/>
-              <w:bottom w:val="single" w:sz="4" w:space="0" w:color="C9D3E0"/>
-              <w:right w:val="single" w:sz="4" w:space="0" w:color="C9D3E0"/>
+            <w:tcW w:w="567" w:type="dxa"/>
+            <w:tcBorders>
+              <w:left w:val="single" w:sz="4" w:space="0" w:color="B8CCE4" w:themeColor="accent1" w:themeTint="66"/>
+              <w:right w:val="single" w:sz="4" w:space="0" w:color="B8CCE4" w:themeColor="accent1" w:themeTint="66"/>
+            </w:tcBorders>
+            <w:shd w:val="clear" w:color="auto" w:fill="FFFFFF" w:themeFill="background1"/>
+          </w:tcPr>
+          <w:p>
+            <w:pPr>
+              <w:spacing w:after="0" w:line="247" w:lineRule="auto"/>
+              <w:rPr>
+                <w:sz w:val="16"/>
+              </w:rPr>
+            </w:pPr>
+          </w:p>
+        </w:tc>
+        <w:tc>
+          <w:tcPr>
+            <w:tcW w:w="2835" w:type="dxa"/>
+            <w:tcBorders>
+              <w:top w:val="single" w:sz="4" w:space="0" w:color="B8CCE4" w:themeColor="accent1" w:themeTint="66"/>
+              <w:left w:val="single" w:sz="4" w:space="0" w:color="B8CCE4" w:themeColor="accent1" w:themeTint="66"/>
+              <w:bottom w:val="single" w:sz="4" w:space="0" w:color="B8CCE4" w:themeColor="accent1" w:themeTint="66"/>
+              <w:right w:val="single" w:sz="4" w:space="0" w:color="B8CCE4" w:themeColor="accent1" w:themeTint="66"/>
             </w:tcBorders>
             <w:tcMar>
               <w:top w:w="70" w:type="dxa"/>
@@ -1724,12 +1846,12 @@
         </w:tc>
         <w:tc>
           <w:tcPr>
-            <w:tcW w:w="1700" w:type="dxa"/>
-            <w:tcBorders>
-              <w:top w:val="single" w:sz="4" w:space="0" w:color="C9D3E0"/>
-              <w:left w:val="single" w:sz="4" w:space="0" w:color="C9D3E0"/>
-              <w:bottom w:val="single" w:sz="4" w:space="0" w:color="C9D3E0"/>
-              <w:right w:val="single" w:sz="4" w:space="0" w:color="C9D3E0"/>
+            <w:tcW w:w="1417" w:type="dxa"/>
+            <w:tcBorders>
+              <w:top w:val="single" w:sz="4" w:space="0" w:color="B8CCE4" w:themeColor="accent1" w:themeTint="66"/>
+              <w:left w:val="single" w:sz="4" w:space="0" w:color="B8CCE4" w:themeColor="accent1" w:themeTint="66"/>
+              <w:bottom w:val="single" w:sz="4" w:space="0" w:color="B8CCE4" w:themeColor="accent1" w:themeTint="66"/>
+              <w:right w:val="single" w:sz="4" w:space="0" w:color="B8CCE4" w:themeColor="accent1" w:themeTint="66"/>
             </w:tcBorders>
             <w:tcMar>
               <w:top w:w="70" w:type="dxa"/>
@@ -1754,12 +1876,12 @@
         </w:tc>
         <w:tc>
           <w:tcPr>
-            <w:tcW w:w="4370" w:type="dxa"/>
-            <w:tcBorders>
-              <w:top w:val="single" w:sz="4" w:space="0" w:color="C9D3E0"/>
-              <w:left w:val="single" w:sz="4" w:space="0" w:color="C9D3E0"/>
-              <w:bottom w:val="single" w:sz="4" w:space="0" w:color="C9D3E0"/>
-              <w:right w:val="single" w:sz="4" w:space="0" w:color="C9D3E0"/>
+            <w:tcW w:w="3307" w:type="dxa"/>
+            <w:tcBorders>
+              <w:top w:val="single" w:sz="4" w:space="0" w:color="B8CCE4" w:themeColor="accent1" w:themeTint="66"/>
+              <w:left w:val="single" w:sz="4" w:space="0" w:color="B8CCE4" w:themeColor="accent1" w:themeTint="66"/>
+              <w:bottom w:val="single" w:sz="4" w:space="0" w:color="B8CCE4" w:themeColor="accent1" w:themeTint="66"/>
+              <w:right w:val="single" w:sz="4" w:space="0" w:color="B8CCE4" w:themeColor="accent1" w:themeTint="66"/>
             </w:tcBorders>
             <w:tcMar>
               <w:top w:w="70" w:type="dxa"/>
@@ -1778,16 +1900,17 @@
       </w:tr>
       <w:tr>
         <w:trPr>
+          <w:trHeight w:val="303"/>
           <w:jc w:val="center"/>
         </w:trPr>
         <w:tc>
           <w:tcPr>
-            <w:tcW w:w="2300" w:type="dxa"/>
-            <w:tcBorders>
-              <w:top w:val="single" w:sz="4" w:space="0" w:color="C9D3E0"/>
-              <w:left w:val="single" w:sz="4" w:space="0" w:color="C9D3E0"/>
-              <w:bottom w:val="single" w:sz="4" w:space="0" w:color="C9D3E0"/>
-              <w:right w:val="single" w:sz="4" w:space="0" w:color="C9D3E0"/>
+            <w:tcW w:w="2403" w:type="dxa"/>
+            <w:tcBorders>
+              <w:top w:val="single" w:sz="4" w:space="0" w:color="B8CCE4" w:themeColor="accent1" w:themeTint="66"/>
+              <w:left w:val="single" w:sz="4" w:space="0" w:color="B8CCE4" w:themeColor="accent1" w:themeTint="66"/>
+              <w:bottom w:val="single" w:sz="4" w:space="0" w:color="B8CCE4" w:themeColor="accent1" w:themeTint="66"/>
+              <w:right w:val="single" w:sz="4" w:space="0" w:color="B8CCE4" w:themeColor="accent1" w:themeTint="66"/>
             </w:tcBorders>
             <w:tcMar>
               <w:top w:w="70" w:type="dxa"/>
@@ -1812,12 +1935,12 @@
         </w:tc>
         <w:tc>
           <w:tcPr>
-            <w:tcW w:w="4700" w:type="dxa"/>
-            <w:tcBorders>
-              <w:top w:val="single" w:sz="4" w:space="0" w:color="C9D3E0"/>
-              <w:left w:val="single" w:sz="4" w:space="0" w:color="C9D3E0"/>
-              <w:bottom w:val="single" w:sz="4" w:space="0" w:color="C9D3E0"/>
-              <w:right w:val="single" w:sz="4" w:space="0" w:color="C9D3E0"/>
+            <w:tcW w:w="4536" w:type="dxa"/>
+            <w:tcBorders>
+              <w:top w:val="single" w:sz="4" w:space="0" w:color="B8CCE4" w:themeColor="accent1" w:themeTint="66"/>
+              <w:left w:val="single" w:sz="4" w:space="0" w:color="B8CCE4" w:themeColor="accent1" w:themeTint="66"/>
+              <w:bottom w:val="single" w:sz="4" w:space="0" w:color="B8CCE4" w:themeColor="accent1" w:themeTint="66"/>
+              <w:right w:val="single" w:sz="4" w:space="0" w:color="B8CCE4" w:themeColor="accent1" w:themeTint="66"/>
             </w:tcBorders>
             <w:tcMar>
               <w:top w:w="70" w:type="dxa"/>
@@ -1841,12 +1964,30 @@
         </w:tc>
         <w:tc>
           <w:tcPr>
-            <w:tcW w:w="2000" w:type="dxa"/>
-            <w:tcBorders>
-              <w:top w:val="single" w:sz="4" w:space="0" w:color="C9D3E0"/>
-              <w:left w:val="single" w:sz="4" w:space="0" w:color="C9D3E0"/>
-              <w:bottom w:val="single" w:sz="4" w:space="0" w:color="C9D3E0"/>
-              <w:right w:val="single" w:sz="4" w:space="0" w:color="C9D3E0"/>
+            <w:tcW w:w="567" w:type="dxa"/>
+            <w:tcBorders>
+              <w:left w:val="single" w:sz="4" w:space="0" w:color="B8CCE4" w:themeColor="accent1" w:themeTint="66"/>
+              <w:right w:val="single" w:sz="4" w:space="0" w:color="B8CCE4" w:themeColor="accent1" w:themeTint="66"/>
+            </w:tcBorders>
+            <w:shd w:val="clear" w:color="auto" w:fill="FFFFFF" w:themeFill="background1"/>
+          </w:tcPr>
+          <w:p>
+            <w:pPr>
+              <w:spacing w:after="0" w:line="247" w:lineRule="auto"/>
+              <w:rPr>
+                <w:sz w:val="16"/>
+              </w:rPr>
+            </w:pPr>
+          </w:p>
+        </w:tc>
+        <w:tc>
+          <w:tcPr>
+            <w:tcW w:w="2835" w:type="dxa"/>
+            <w:tcBorders>
+              <w:top w:val="single" w:sz="4" w:space="0" w:color="B8CCE4" w:themeColor="accent1" w:themeTint="66"/>
+              <w:left w:val="single" w:sz="4" w:space="0" w:color="B8CCE4" w:themeColor="accent1" w:themeTint="66"/>
+              <w:bottom w:val="single" w:sz="4" w:space="0" w:color="B8CCE4" w:themeColor="accent1" w:themeTint="66"/>
+              <w:right w:val="single" w:sz="4" w:space="0" w:color="B8CCE4" w:themeColor="accent1" w:themeTint="66"/>
             </w:tcBorders>
             <w:tcMar>
               <w:top w:w="70" w:type="dxa"/>
@@ -1878,12 +2019,12 @@
         </w:tc>
         <w:tc>
           <w:tcPr>
-            <w:tcW w:w="1700" w:type="dxa"/>
-            <w:tcBorders>
-              <w:top w:val="single" w:sz="4" w:space="0" w:color="C9D3E0"/>
-              <w:left w:val="single" w:sz="4" w:space="0" w:color="C9D3E0"/>
-              <w:bottom w:val="single" w:sz="4" w:space="0" w:color="C9D3E0"/>
-              <w:right w:val="single" w:sz="4" w:space="0" w:color="C9D3E0"/>
+            <w:tcW w:w="1417" w:type="dxa"/>
+            <w:tcBorders>
+              <w:top w:val="single" w:sz="4" w:space="0" w:color="B8CCE4" w:themeColor="accent1" w:themeTint="66"/>
+              <w:left w:val="single" w:sz="4" w:space="0" w:color="B8CCE4" w:themeColor="accent1" w:themeTint="66"/>
+              <w:bottom w:val="single" w:sz="4" w:space="0" w:color="B8CCE4" w:themeColor="accent1" w:themeTint="66"/>
+              <w:right w:val="single" w:sz="4" w:space="0" w:color="B8CCE4" w:themeColor="accent1" w:themeTint="66"/>
             </w:tcBorders>
             <w:tcMar>
               <w:top w:w="70" w:type="dxa"/>
@@ -1909,12 +2050,12 @@
         </w:tc>
         <w:tc>
           <w:tcPr>
-            <w:tcW w:w="4370" w:type="dxa"/>
-            <w:tcBorders>
-              <w:top w:val="single" w:sz="4" w:space="0" w:color="C9D3E0"/>
-              <w:left w:val="single" w:sz="4" w:space="0" w:color="C9D3E0"/>
-              <w:bottom w:val="single" w:sz="4" w:space="0" w:color="C9D3E0"/>
-              <w:right w:val="single" w:sz="4" w:space="0" w:color="C9D3E0"/>
+            <w:tcW w:w="3307" w:type="dxa"/>
+            <w:tcBorders>
+              <w:top w:val="single" w:sz="4" w:space="0" w:color="B8CCE4" w:themeColor="accent1" w:themeTint="66"/>
+              <w:left w:val="single" w:sz="4" w:space="0" w:color="B8CCE4" w:themeColor="accent1" w:themeTint="66"/>
+              <w:bottom w:val="single" w:sz="4" w:space="0" w:color="B8CCE4" w:themeColor="accent1" w:themeTint="66"/>
+              <w:right w:val="single" w:sz="4" w:space="0" w:color="B8CCE4" w:themeColor="accent1" w:themeTint="66"/>
             </w:tcBorders>
             <w:tcMar>
               <w:top w:w="70" w:type="dxa"/>
@@ -1933,16 +2074,17 @@
       </w:tr>
       <w:tr>
         <w:trPr>
+          <w:trHeight w:val="303"/>
           <w:jc w:val="center"/>
         </w:trPr>
         <w:tc>
           <w:tcPr>
-            <w:tcW w:w="2300" w:type="dxa"/>
-            <w:tcBorders>
-              <w:top w:val="single" w:sz="4" w:space="0" w:color="C9D3E0"/>
-              <w:left w:val="single" w:sz="4" w:space="0" w:color="C9D3E0"/>
-              <w:bottom w:val="single" w:sz="4" w:space="0" w:color="C9D3E0"/>
-              <w:right w:val="single" w:sz="4" w:space="0" w:color="C9D3E0"/>
+            <w:tcW w:w="2403" w:type="dxa"/>
+            <w:tcBorders>
+              <w:top w:val="single" w:sz="4" w:space="0" w:color="B8CCE4" w:themeColor="accent1" w:themeTint="66"/>
+              <w:left w:val="single" w:sz="4" w:space="0" w:color="B8CCE4" w:themeColor="accent1" w:themeTint="66"/>
+              <w:bottom w:val="single" w:sz="4" w:space="0" w:color="B8CCE4" w:themeColor="accent1" w:themeTint="66"/>
+              <w:right w:val="single" w:sz="4" w:space="0" w:color="B8CCE4" w:themeColor="accent1" w:themeTint="66"/>
             </w:tcBorders>
             <w:tcMar>
               <w:top w:w="70" w:type="dxa"/>
@@ -1967,32 +2109,32 @@
         </w:tc>
         <w:tc>
           <w:tcPr>
-            <w:tcW w:w="4700" w:type="dxa"/>
-            <w:tcBorders>
-              <w:top w:val="single" w:sz="4" w:space="0" w:color="C9D3E0"/>
-              <w:left w:val="single" w:sz="4" w:space="0" w:color="C9D3E0"/>
-              <w:bottom w:val="single" w:sz="4" w:space="0" w:color="C9D3E0"/>
-              <w:right w:val="single" w:sz="4" w:space="0" w:color="C9D3E0"/>
-            </w:tcBorders>
-            <w:tcMar>
-              <w:top w:w="70" w:type="dxa"/>
-              <w:left w:w="90" w:type="dxa"/>
-              <w:bottom w:w="70" w:type="dxa"/>
-              <w:right w:w="90" w:type="dxa"/>
-            </w:tcMar>
-            <w:vAlign w:val="center"/>
-          </w:tcPr>
-          <w:p>
-            <w:pPr>
-              <w:spacing w:after="0" w:line="247" w:lineRule="auto"/>
-              <w:rPr>
-                <w:rFonts w:hint="eastAsia"/>
+            <w:tcW w:w="4536" w:type="dxa"/>
+            <w:tcBorders>
+              <w:top w:val="single" w:sz="4" w:space="0" w:color="B8CCE4" w:themeColor="accent1" w:themeTint="66"/>
+              <w:left w:val="single" w:sz="4" w:space="0" w:color="B8CCE4" w:themeColor="accent1" w:themeTint="66"/>
+              <w:bottom w:val="single" w:sz="4" w:space="0" w:color="B8CCE4" w:themeColor="accent1" w:themeTint="66"/>
+              <w:right w:val="single" w:sz="4" w:space="0" w:color="B8CCE4" w:themeColor="accent1" w:themeTint="66"/>
+            </w:tcBorders>
+            <w:tcMar>
+              <w:top w:w="70" w:type="dxa"/>
+              <w:left w:w="90" w:type="dxa"/>
+              <w:bottom w:w="70" w:type="dxa"/>
+              <w:right w:w="90" w:type="dxa"/>
+            </w:tcMar>
+            <w:vAlign w:val="center"/>
+          </w:tcPr>
+          <w:p>
+            <w:pPr>
+              <w:spacing w:after="0" w:line="247" w:lineRule="auto"/>
+              <w:rPr>
                 <w:lang w:eastAsia="ko-KR"/>
               </w:rPr>
             </w:pPr>
             <w:r>
               <w:rPr>
                 <w:sz w:val="16"/>
+                <w:lang w:eastAsia="ko-KR"/>
               </w:rPr>
               <w:t>㈜</w:t>
             </w:r>
@@ -2001,6 +2143,7 @@
             <w:r>
               <w:rPr>
                 <w:sz w:val="16"/>
+                <w:lang w:eastAsia="ko-KR"/>
               </w:rPr>
               <w:t>인픽스</w:t>
             </w:r>
@@ -2043,29 +2186,47 @@
         </w:tc>
         <w:tc>
           <w:tcPr>
-            <w:tcW w:w="2000" w:type="dxa"/>
-            <w:tcBorders>
-              <w:top w:val="single" w:sz="4" w:space="0" w:color="C9D3E0"/>
-              <w:left w:val="single" w:sz="4" w:space="0" w:color="C9D3E0"/>
-              <w:bottom w:val="single" w:sz="4" w:space="0" w:color="C9D3E0"/>
-              <w:right w:val="single" w:sz="4" w:space="0" w:color="C9D3E0"/>
-            </w:tcBorders>
-            <w:tcMar>
-              <w:top w:w="70" w:type="dxa"/>
-              <w:left w:w="90" w:type="dxa"/>
-              <w:bottom w:w="70" w:type="dxa"/>
-              <w:right w:w="90" w:type="dxa"/>
-            </w:tcMar>
-            <w:vAlign w:val="center"/>
-          </w:tcPr>
-          <w:p>
-            <w:pPr>
-              <w:spacing w:after="0" w:line="247" w:lineRule="auto"/>
-            </w:pPr>
-            <w:r>
+            <w:tcW w:w="567" w:type="dxa"/>
+            <w:tcBorders>
+              <w:left w:val="single" w:sz="4" w:space="0" w:color="B8CCE4" w:themeColor="accent1" w:themeTint="66"/>
+              <w:right w:val="single" w:sz="4" w:space="0" w:color="B8CCE4" w:themeColor="accent1" w:themeTint="66"/>
+            </w:tcBorders>
+            <w:shd w:val="clear" w:color="auto" w:fill="FFFFFF" w:themeFill="background1"/>
+          </w:tcPr>
+          <w:p>
+            <w:pPr>
+              <w:spacing w:after="0" w:line="247" w:lineRule="auto"/>
               <w:rPr>
                 <w:sz w:val="16"/>
               </w:rPr>
+            </w:pPr>
+          </w:p>
+        </w:tc>
+        <w:tc>
+          <w:tcPr>
+            <w:tcW w:w="2835" w:type="dxa"/>
+            <w:tcBorders>
+              <w:top w:val="single" w:sz="4" w:space="0" w:color="B8CCE4" w:themeColor="accent1" w:themeTint="66"/>
+              <w:left w:val="single" w:sz="4" w:space="0" w:color="B8CCE4" w:themeColor="accent1" w:themeTint="66"/>
+              <w:bottom w:val="single" w:sz="4" w:space="0" w:color="B8CCE4" w:themeColor="accent1" w:themeTint="66"/>
+              <w:right w:val="single" w:sz="4" w:space="0" w:color="B8CCE4" w:themeColor="accent1" w:themeTint="66"/>
+            </w:tcBorders>
+            <w:tcMar>
+              <w:top w:w="70" w:type="dxa"/>
+              <w:left w:w="90" w:type="dxa"/>
+              <w:bottom w:w="70" w:type="dxa"/>
+              <w:right w:w="90" w:type="dxa"/>
+            </w:tcMar>
+            <w:vAlign w:val="center"/>
+          </w:tcPr>
+          <w:p>
+            <w:pPr>
+              <w:spacing w:after="0" w:line="247" w:lineRule="auto"/>
+            </w:pPr>
+            <w:r>
+              <w:rPr>
+                <w:sz w:val="16"/>
+              </w:rPr>
               <w:t xml:space="preserve">AI </w:t>
             </w:r>
             <w:proofErr w:type="spellStart"/>
@@ -2080,12 +2241,12 @@
         </w:tc>
         <w:tc>
           <w:tcPr>
-            <w:tcW w:w="1700" w:type="dxa"/>
-            <w:tcBorders>
-              <w:top w:val="single" w:sz="4" w:space="0" w:color="C9D3E0"/>
-              <w:left w:val="single" w:sz="4" w:space="0" w:color="C9D3E0"/>
-              <w:bottom w:val="single" w:sz="4" w:space="0" w:color="C9D3E0"/>
-              <w:right w:val="single" w:sz="4" w:space="0" w:color="C9D3E0"/>
+            <w:tcW w:w="1417" w:type="dxa"/>
+            <w:tcBorders>
+              <w:top w:val="single" w:sz="4" w:space="0" w:color="B8CCE4" w:themeColor="accent1" w:themeTint="66"/>
+              <w:left w:val="single" w:sz="4" w:space="0" w:color="B8CCE4" w:themeColor="accent1" w:themeTint="66"/>
+              <w:bottom w:val="single" w:sz="4" w:space="0" w:color="B8CCE4" w:themeColor="accent1" w:themeTint="66"/>
+              <w:right w:val="single" w:sz="4" w:space="0" w:color="B8CCE4" w:themeColor="accent1" w:themeTint="66"/>
             </w:tcBorders>
             <w:tcMar>
               <w:top w:w="70" w:type="dxa"/>
@@ -2110,12 +2271,12 @@
         </w:tc>
         <w:tc>
           <w:tcPr>
-            <w:tcW w:w="4370" w:type="dxa"/>
-            <w:tcBorders>
-              <w:top w:val="single" w:sz="4" w:space="0" w:color="C9D3E0"/>
-              <w:left w:val="single" w:sz="4" w:space="0" w:color="C9D3E0"/>
-              <w:bottom w:val="single" w:sz="4" w:space="0" w:color="C9D3E0"/>
-              <w:right w:val="single" w:sz="4" w:space="0" w:color="C9D3E0"/>
+            <w:tcW w:w="3307" w:type="dxa"/>
+            <w:tcBorders>
+              <w:top w:val="single" w:sz="4" w:space="0" w:color="B8CCE4" w:themeColor="accent1" w:themeTint="66"/>
+              <w:left w:val="single" w:sz="4" w:space="0" w:color="B8CCE4" w:themeColor="accent1" w:themeTint="66"/>
+              <w:bottom w:val="single" w:sz="4" w:space="0" w:color="B8CCE4" w:themeColor="accent1" w:themeTint="66"/>
+              <w:right w:val="single" w:sz="4" w:space="0" w:color="B8CCE4" w:themeColor="accent1" w:themeTint="66"/>
             </w:tcBorders>
             <w:tcMar>
               <w:top w:w="70" w:type="dxa"/>
@@ -2134,16 +2295,17 @@
       </w:tr>
       <w:tr>
         <w:trPr>
+          <w:trHeight w:val="313"/>
           <w:jc w:val="center"/>
         </w:trPr>
         <w:tc>
           <w:tcPr>
-            <w:tcW w:w="2300" w:type="dxa"/>
-            <w:tcBorders>
-              <w:top w:val="single" w:sz="4" w:space="0" w:color="C9D3E0"/>
-              <w:left w:val="single" w:sz="4" w:space="0" w:color="C9D3E0"/>
-              <w:bottom w:val="single" w:sz="4" w:space="0" w:color="C9D3E0"/>
-              <w:right w:val="single" w:sz="4" w:space="0" w:color="C9D3E0"/>
+            <w:tcW w:w="2403" w:type="dxa"/>
+            <w:tcBorders>
+              <w:top w:val="single" w:sz="4" w:space="0" w:color="B8CCE4" w:themeColor="accent1" w:themeTint="66"/>
+              <w:left w:val="single" w:sz="4" w:space="0" w:color="B8CCE4" w:themeColor="accent1" w:themeTint="66"/>
+              <w:bottom w:val="single" w:sz="4" w:space="0" w:color="B8CCE4" w:themeColor="accent1" w:themeTint="66"/>
+              <w:right w:val="single" w:sz="4" w:space="0" w:color="B8CCE4" w:themeColor="accent1" w:themeTint="66"/>
             </w:tcBorders>
             <w:tcMar>
               <w:top w:w="70" w:type="dxa"/>
@@ -2168,12 +2330,12 @@
         </w:tc>
         <w:tc>
           <w:tcPr>
-            <w:tcW w:w="4700" w:type="dxa"/>
-            <w:tcBorders>
-              <w:top w:val="single" w:sz="4" w:space="0" w:color="C9D3E0"/>
-              <w:left w:val="single" w:sz="4" w:space="0" w:color="C9D3E0"/>
-              <w:bottom w:val="single" w:sz="4" w:space="0" w:color="C9D3E0"/>
-              <w:right w:val="single" w:sz="4" w:space="0" w:color="C9D3E0"/>
+            <w:tcW w:w="4536" w:type="dxa"/>
+            <w:tcBorders>
+              <w:top w:val="single" w:sz="4" w:space="0" w:color="B8CCE4" w:themeColor="accent1" w:themeTint="66"/>
+              <w:left w:val="single" w:sz="4" w:space="0" w:color="B8CCE4" w:themeColor="accent1" w:themeTint="66"/>
+              <w:bottom w:val="single" w:sz="4" w:space="0" w:color="B8CCE4" w:themeColor="accent1" w:themeTint="66"/>
+              <w:right w:val="single" w:sz="4" w:space="0" w:color="B8CCE4" w:themeColor="accent1" w:themeTint="66"/>
             </w:tcBorders>
             <w:tcMar>
               <w:top w:w="70" w:type="dxa"/>
@@ -2197,12 +2359,30 @@
         </w:tc>
         <w:tc>
           <w:tcPr>
-            <w:tcW w:w="2000" w:type="dxa"/>
-            <w:tcBorders>
-              <w:top w:val="single" w:sz="4" w:space="0" w:color="C9D3E0"/>
-              <w:left w:val="single" w:sz="4" w:space="0" w:color="C9D3E0"/>
-              <w:bottom w:val="single" w:sz="4" w:space="0" w:color="C9D3E0"/>
-              <w:right w:val="single" w:sz="4" w:space="0" w:color="C9D3E0"/>
+            <w:tcW w:w="567" w:type="dxa"/>
+            <w:tcBorders>
+              <w:left w:val="single" w:sz="4" w:space="0" w:color="B8CCE4" w:themeColor="accent1" w:themeTint="66"/>
+              <w:right w:val="single" w:sz="4" w:space="0" w:color="B8CCE4" w:themeColor="accent1" w:themeTint="66"/>
+            </w:tcBorders>
+            <w:shd w:val="clear" w:color="auto" w:fill="FFFFFF" w:themeFill="background1"/>
+          </w:tcPr>
+          <w:p>
+            <w:pPr>
+              <w:spacing w:after="0" w:line="247" w:lineRule="auto"/>
+              <w:rPr>
+                <w:sz w:val="16"/>
+              </w:rPr>
+            </w:pPr>
+          </w:p>
+        </w:tc>
+        <w:tc>
+          <w:tcPr>
+            <w:tcW w:w="2835" w:type="dxa"/>
+            <w:tcBorders>
+              <w:top w:val="single" w:sz="4" w:space="0" w:color="B8CCE4" w:themeColor="accent1" w:themeTint="66"/>
+              <w:left w:val="single" w:sz="4" w:space="0" w:color="B8CCE4" w:themeColor="accent1" w:themeTint="66"/>
+              <w:bottom w:val="single" w:sz="4" w:space="0" w:color="B8CCE4" w:themeColor="accent1" w:themeTint="66"/>
+              <w:right w:val="single" w:sz="4" w:space="0" w:color="B8CCE4" w:themeColor="accent1" w:themeTint="66"/>
             </w:tcBorders>
             <w:tcMar>
               <w:top w:w="70" w:type="dxa"/>
@@ -2255,12 +2435,12 @@
         </w:tc>
         <w:tc>
           <w:tcPr>
-            <w:tcW w:w="1700" w:type="dxa"/>
-            <w:tcBorders>
-              <w:top w:val="single" w:sz="4" w:space="0" w:color="C9D3E0"/>
-              <w:left w:val="single" w:sz="4" w:space="0" w:color="C9D3E0"/>
-              <w:bottom w:val="single" w:sz="4" w:space="0" w:color="C9D3E0"/>
-              <w:right w:val="single" w:sz="4" w:space="0" w:color="C9D3E0"/>
+            <w:tcW w:w="1417" w:type="dxa"/>
+            <w:tcBorders>
+              <w:top w:val="single" w:sz="4" w:space="0" w:color="B8CCE4" w:themeColor="accent1" w:themeTint="66"/>
+              <w:left w:val="single" w:sz="4" w:space="0" w:color="B8CCE4" w:themeColor="accent1" w:themeTint="66"/>
+              <w:bottom w:val="single" w:sz="4" w:space="0" w:color="B8CCE4" w:themeColor="accent1" w:themeTint="66"/>
+              <w:right w:val="single" w:sz="4" w:space="0" w:color="B8CCE4" w:themeColor="accent1" w:themeTint="66"/>
             </w:tcBorders>
             <w:tcMar>
               <w:top w:w="70" w:type="dxa"/>
@@ -2285,12 +2465,12 @@
         </w:tc>
         <w:tc>
           <w:tcPr>
-            <w:tcW w:w="4370" w:type="dxa"/>
-            <w:tcBorders>
-              <w:top w:val="single" w:sz="4" w:space="0" w:color="C9D3E0"/>
-              <w:left w:val="single" w:sz="4" w:space="0" w:color="C9D3E0"/>
-              <w:bottom w:val="single" w:sz="4" w:space="0" w:color="C9D3E0"/>
-              <w:right w:val="single" w:sz="4" w:space="0" w:color="C9D3E0"/>
+            <w:tcW w:w="3307" w:type="dxa"/>
+            <w:tcBorders>
+              <w:top w:val="single" w:sz="4" w:space="0" w:color="B8CCE4" w:themeColor="accent1" w:themeTint="66"/>
+              <w:left w:val="single" w:sz="4" w:space="0" w:color="B8CCE4" w:themeColor="accent1" w:themeTint="66"/>
+              <w:bottom w:val="single" w:sz="4" w:space="0" w:color="B8CCE4" w:themeColor="accent1" w:themeTint="66"/>
+              <w:right w:val="single" w:sz="4" w:space="0" w:color="B8CCE4" w:themeColor="accent1" w:themeTint="66"/>
             </w:tcBorders>
             <w:tcMar>
               <w:top w:w="70" w:type="dxa"/>
@@ -2309,16 +2489,17 @@
       </w:tr>
       <w:tr>
         <w:trPr>
+          <w:trHeight w:val="303"/>
           <w:jc w:val="center"/>
         </w:trPr>
         <w:tc>
           <w:tcPr>
-            <w:tcW w:w="2300" w:type="dxa"/>
-            <w:tcBorders>
-              <w:top w:val="single" w:sz="4" w:space="0" w:color="C9D3E0"/>
-              <w:left w:val="single" w:sz="4" w:space="0" w:color="C9D3E0"/>
-              <w:bottom w:val="single" w:sz="4" w:space="0" w:color="C9D3E0"/>
-              <w:right w:val="single" w:sz="4" w:space="0" w:color="C9D3E0"/>
+            <w:tcW w:w="2403" w:type="dxa"/>
+            <w:tcBorders>
+              <w:top w:val="single" w:sz="4" w:space="0" w:color="B8CCE4" w:themeColor="accent1" w:themeTint="66"/>
+              <w:left w:val="single" w:sz="4" w:space="0" w:color="B8CCE4" w:themeColor="accent1" w:themeTint="66"/>
+              <w:bottom w:val="single" w:sz="4" w:space="0" w:color="B8CCE4" w:themeColor="accent1" w:themeTint="66"/>
+              <w:right w:val="single" w:sz="4" w:space="0" w:color="B8CCE4" w:themeColor="accent1" w:themeTint="66"/>
             </w:tcBorders>
             <w:tcMar>
               <w:top w:w="70" w:type="dxa"/>
@@ -2343,12 +2524,12 @@
         </w:tc>
         <w:tc>
           <w:tcPr>
-            <w:tcW w:w="4700" w:type="dxa"/>
-            <w:tcBorders>
-              <w:top w:val="single" w:sz="4" w:space="0" w:color="C9D3E0"/>
-              <w:left w:val="single" w:sz="4" w:space="0" w:color="C9D3E0"/>
-              <w:bottom w:val="single" w:sz="4" w:space="0" w:color="C9D3E0"/>
-              <w:right w:val="single" w:sz="4" w:space="0" w:color="C9D3E0"/>
+            <w:tcW w:w="4536" w:type="dxa"/>
+            <w:tcBorders>
+              <w:top w:val="single" w:sz="4" w:space="0" w:color="B8CCE4" w:themeColor="accent1" w:themeTint="66"/>
+              <w:left w:val="single" w:sz="4" w:space="0" w:color="B8CCE4" w:themeColor="accent1" w:themeTint="66"/>
+              <w:bottom w:val="single" w:sz="4" w:space="0" w:color="B8CCE4" w:themeColor="accent1" w:themeTint="66"/>
+              <w:right w:val="single" w:sz="4" w:space="0" w:color="B8CCE4" w:themeColor="accent1" w:themeTint="66"/>
             </w:tcBorders>
             <w:tcMar>
               <w:top w:w="70" w:type="dxa"/>
@@ -2408,12 +2589,30 @@
         </w:tc>
         <w:tc>
           <w:tcPr>
-            <w:tcW w:w="2000" w:type="dxa"/>
-            <w:tcBorders>
-              <w:top w:val="single" w:sz="4" w:space="0" w:color="C9D3E0"/>
-              <w:left w:val="single" w:sz="4" w:space="0" w:color="C9D3E0"/>
-              <w:bottom w:val="single" w:sz="4" w:space="0" w:color="C9D3E0"/>
-              <w:right w:val="single" w:sz="4" w:space="0" w:color="C9D3E0"/>
+            <w:tcW w:w="567" w:type="dxa"/>
+            <w:tcBorders>
+              <w:left w:val="single" w:sz="4" w:space="0" w:color="B8CCE4" w:themeColor="accent1" w:themeTint="66"/>
+              <w:right w:val="single" w:sz="4" w:space="0" w:color="B8CCE4" w:themeColor="accent1" w:themeTint="66"/>
+            </w:tcBorders>
+            <w:shd w:val="clear" w:color="auto" w:fill="FFFFFF" w:themeFill="background1"/>
+          </w:tcPr>
+          <w:p>
+            <w:pPr>
+              <w:spacing w:after="0" w:line="247" w:lineRule="auto"/>
+              <w:rPr>
+                <w:sz w:val="16"/>
+              </w:rPr>
+            </w:pPr>
+          </w:p>
+        </w:tc>
+        <w:tc>
+          <w:tcPr>
+            <w:tcW w:w="2835" w:type="dxa"/>
+            <w:tcBorders>
+              <w:top w:val="single" w:sz="4" w:space="0" w:color="B8CCE4" w:themeColor="accent1" w:themeTint="66"/>
+              <w:left w:val="single" w:sz="4" w:space="0" w:color="B8CCE4" w:themeColor="accent1" w:themeTint="66"/>
+              <w:bottom w:val="single" w:sz="4" w:space="0" w:color="B8CCE4" w:themeColor="accent1" w:themeTint="66"/>
+              <w:right w:val="single" w:sz="4" w:space="0" w:color="B8CCE4" w:themeColor="accent1" w:themeTint="66"/>
             </w:tcBorders>
             <w:tcMar>
               <w:top w:w="70" w:type="dxa"/>
@@ -2450,12 +2649,12 @@
         </w:tc>
         <w:tc>
           <w:tcPr>
-            <w:tcW w:w="1700" w:type="dxa"/>
-            <w:tcBorders>
-              <w:top w:val="single" w:sz="4" w:space="0" w:color="C9D3E0"/>
-              <w:left w:val="single" w:sz="4" w:space="0" w:color="C9D3E0"/>
-              <w:bottom w:val="single" w:sz="4" w:space="0" w:color="C9D3E0"/>
-              <w:right w:val="single" w:sz="4" w:space="0" w:color="C9D3E0"/>
+            <w:tcW w:w="1417" w:type="dxa"/>
+            <w:tcBorders>
+              <w:top w:val="single" w:sz="4" w:space="0" w:color="B8CCE4" w:themeColor="accent1" w:themeTint="66"/>
+              <w:left w:val="single" w:sz="4" w:space="0" w:color="B8CCE4" w:themeColor="accent1" w:themeTint="66"/>
+              <w:bottom w:val="single" w:sz="4" w:space="0" w:color="B8CCE4" w:themeColor="accent1" w:themeTint="66"/>
+              <w:right w:val="single" w:sz="4" w:space="0" w:color="B8CCE4" w:themeColor="accent1" w:themeTint="66"/>
             </w:tcBorders>
             <w:tcMar>
               <w:top w:w="70" w:type="dxa"/>
@@ -2480,12 +2679,12 @@
         </w:tc>
         <w:tc>
           <w:tcPr>
-            <w:tcW w:w="4370" w:type="dxa"/>
-            <w:tcBorders>
-              <w:top w:val="single" w:sz="4" w:space="0" w:color="C9D3E0"/>
-              <w:left w:val="single" w:sz="4" w:space="0" w:color="C9D3E0"/>
-              <w:bottom w:val="single" w:sz="4" w:space="0" w:color="C9D3E0"/>
-              <w:right w:val="single" w:sz="4" w:space="0" w:color="C9D3E0"/>
+            <w:tcW w:w="3307" w:type="dxa"/>
+            <w:tcBorders>
+              <w:top w:val="single" w:sz="4" w:space="0" w:color="B8CCE4" w:themeColor="accent1" w:themeTint="66"/>
+              <w:left w:val="single" w:sz="4" w:space="0" w:color="B8CCE4" w:themeColor="accent1" w:themeTint="66"/>
+              <w:bottom w:val="single" w:sz="4" w:space="0" w:color="B8CCE4" w:themeColor="accent1" w:themeTint="66"/>
+              <w:right w:val="single" w:sz="4" w:space="0" w:color="B8CCE4" w:themeColor="accent1" w:themeTint="66"/>
             </w:tcBorders>
             <w:tcMar>
               <w:top w:w="70" w:type="dxa"/>
@@ -2504,16 +2703,17 @@
       </w:tr>
       <w:tr>
         <w:trPr>
+          <w:trHeight w:val="303"/>
           <w:jc w:val="center"/>
         </w:trPr>
         <w:tc>
           <w:tcPr>
-            <w:tcW w:w="2300" w:type="dxa"/>
-            <w:tcBorders>
-              <w:top w:val="single" w:sz="4" w:space="0" w:color="C9D3E0"/>
-              <w:left w:val="single" w:sz="4" w:space="0" w:color="C9D3E0"/>
-              <w:bottom w:val="single" w:sz="4" w:space="0" w:color="C9D3E0"/>
-              <w:right w:val="single" w:sz="4" w:space="0" w:color="C9D3E0"/>
+            <w:tcW w:w="2403" w:type="dxa"/>
+            <w:tcBorders>
+              <w:top w:val="single" w:sz="4" w:space="0" w:color="B8CCE4" w:themeColor="accent1" w:themeTint="66"/>
+              <w:left w:val="single" w:sz="4" w:space="0" w:color="B8CCE4" w:themeColor="accent1" w:themeTint="66"/>
+              <w:bottom w:val="single" w:sz="4" w:space="0" w:color="B8CCE4" w:themeColor="accent1" w:themeTint="66"/>
+              <w:right w:val="single" w:sz="4" w:space="0" w:color="B8CCE4" w:themeColor="accent1" w:themeTint="66"/>
             </w:tcBorders>
             <w:tcMar>
               <w:top w:w="70" w:type="dxa"/>
@@ -2538,12 +2738,12 @@
         </w:tc>
         <w:tc>
           <w:tcPr>
-            <w:tcW w:w="4700" w:type="dxa"/>
-            <w:tcBorders>
-              <w:top w:val="single" w:sz="4" w:space="0" w:color="C9D3E0"/>
-              <w:left w:val="single" w:sz="4" w:space="0" w:color="C9D3E0"/>
-              <w:bottom w:val="single" w:sz="4" w:space="0" w:color="C9D3E0"/>
-              <w:right w:val="single" w:sz="4" w:space="0" w:color="C9D3E0"/>
+            <w:tcW w:w="4536" w:type="dxa"/>
+            <w:tcBorders>
+              <w:top w:val="single" w:sz="4" w:space="0" w:color="B8CCE4" w:themeColor="accent1" w:themeTint="66"/>
+              <w:left w:val="single" w:sz="4" w:space="0" w:color="B8CCE4" w:themeColor="accent1" w:themeTint="66"/>
+              <w:bottom w:val="single" w:sz="4" w:space="0" w:color="B8CCE4" w:themeColor="accent1" w:themeTint="66"/>
+              <w:right w:val="single" w:sz="4" w:space="0" w:color="B8CCE4" w:themeColor="accent1" w:themeTint="66"/>
             </w:tcBorders>
             <w:tcMar>
               <w:top w:w="70" w:type="dxa"/>
@@ -2567,45 +2767,64 @@
         </w:tc>
         <w:tc>
           <w:tcPr>
-            <w:tcW w:w="2000" w:type="dxa"/>
-            <w:tcBorders>
-              <w:top w:val="single" w:sz="4" w:space="0" w:color="C9D3E0"/>
-              <w:left w:val="single" w:sz="4" w:space="0" w:color="C9D3E0"/>
-              <w:bottom w:val="single" w:sz="4" w:space="0" w:color="C9D3E0"/>
-              <w:right w:val="single" w:sz="4" w:space="0" w:color="C9D3E0"/>
-            </w:tcBorders>
-            <w:tcMar>
-              <w:top w:w="70" w:type="dxa"/>
-              <w:left w:w="90" w:type="dxa"/>
-              <w:bottom w:w="70" w:type="dxa"/>
-              <w:right w:w="90" w:type="dxa"/>
-            </w:tcMar>
-            <w:vAlign w:val="center"/>
-          </w:tcPr>
-          <w:p>
-            <w:pPr>
-              <w:spacing w:after="0" w:line="247" w:lineRule="auto"/>
-              <w:rPr>
-                <w:lang w:eastAsia="ko-KR"/>
-              </w:rPr>
-            </w:pPr>
-            <w:r>
+            <w:tcW w:w="567" w:type="dxa"/>
+            <w:tcBorders>
+              <w:left w:val="single" w:sz="4" w:space="0" w:color="B8CCE4" w:themeColor="accent1" w:themeTint="66"/>
+              <w:right w:val="single" w:sz="4" w:space="0" w:color="B8CCE4" w:themeColor="accent1" w:themeTint="66"/>
+            </w:tcBorders>
+            <w:shd w:val="clear" w:color="auto" w:fill="FFFFFF" w:themeFill="background1"/>
+          </w:tcPr>
+          <w:p>
+            <w:pPr>
+              <w:spacing w:after="0" w:line="247" w:lineRule="auto"/>
               <w:rPr>
                 <w:rFonts w:hint="eastAsia"/>
                 <w:lang w:eastAsia="ko-KR"/>
               </w:rPr>
+            </w:pPr>
+          </w:p>
+        </w:tc>
+        <w:tc>
+          <w:tcPr>
+            <w:tcW w:w="2835" w:type="dxa"/>
+            <w:tcBorders>
+              <w:top w:val="single" w:sz="4" w:space="0" w:color="B8CCE4" w:themeColor="accent1" w:themeTint="66"/>
+              <w:left w:val="single" w:sz="4" w:space="0" w:color="B8CCE4" w:themeColor="accent1" w:themeTint="66"/>
+              <w:bottom w:val="single" w:sz="4" w:space="0" w:color="B8CCE4" w:themeColor="accent1" w:themeTint="66"/>
+              <w:right w:val="single" w:sz="4" w:space="0" w:color="B8CCE4" w:themeColor="accent1" w:themeTint="66"/>
+            </w:tcBorders>
+            <w:tcMar>
+              <w:top w:w="70" w:type="dxa"/>
+              <w:left w:w="90" w:type="dxa"/>
+              <w:bottom w:w="70" w:type="dxa"/>
+              <w:right w:w="90" w:type="dxa"/>
+            </w:tcMar>
+            <w:vAlign w:val="center"/>
+          </w:tcPr>
+          <w:p>
+            <w:pPr>
+              <w:spacing w:after="0" w:line="247" w:lineRule="auto"/>
+              <w:rPr>
+                <w:lang w:eastAsia="ko-KR"/>
+              </w:rPr>
+            </w:pPr>
+            <w:r>
+              <w:rPr>
+                <w:rFonts w:hint="eastAsia"/>
+                <w:lang w:eastAsia="ko-KR"/>
+              </w:rPr>
               <w:t>React</w:t>
             </w:r>
           </w:p>
         </w:tc>
         <w:tc>
           <w:tcPr>
-            <w:tcW w:w="1700" w:type="dxa"/>
-            <w:tcBorders>
-              <w:top w:val="single" w:sz="4" w:space="0" w:color="C9D3E0"/>
-              <w:left w:val="single" w:sz="4" w:space="0" w:color="C9D3E0"/>
-              <w:bottom w:val="single" w:sz="4" w:space="0" w:color="C9D3E0"/>
-              <w:right w:val="single" w:sz="4" w:space="0" w:color="C9D3E0"/>
+            <w:tcW w:w="1417" w:type="dxa"/>
+            <w:tcBorders>
+              <w:top w:val="single" w:sz="4" w:space="0" w:color="B8CCE4" w:themeColor="accent1" w:themeTint="66"/>
+              <w:left w:val="single" w:sz="4" w:space="0" w:color="B8CCE4" w:themeColor="accent1" w:themeTint="66"/>
+              <w:bottom w:val="single" w:sz="4" w:space="0" w:color="B8CCE4" w:themeColor="accent1" w:themeTint="66"/>
+              <w:right w:val="single" w:sz="4" w:space="0" w:color="B8CCE4" w:themeColor="accent1" w:themeTint="66"/>
             </w:tcBorders>
             <w:tcMar>
               <w:top w:w="70" w:type="dxa"/>
@@ -2631,12 +2850,12 @@
         </w:tc>
         <w:tc>
           <w:tcPr>
-            <w:tcW w:w="4370" w:type="dxa"/>
-            <w:tcBorders>
-              <w:top w:val="single" w:sz="4" w:space="0" w:color="C9D3E0"/>
-              <w:left w:val="single" w:sz="4" w:space="0" w:color="C9D3E0"/>
-              <w:bottom w:val="single" w:sz="4" w:space="0" w:color="C9D3E0"/>
-              <w:right w:val="single" w:sz="4" w:space="0" w:color="C9D3E0"/>
+            <w:tcW w:w="3307" w:type="dxa"/>
+            <w:tcBorders>
+              <w:top w:val="single" w:sz="4" w:space="0" w:color="B8CCE4" w:themeColor="accent1" w:themeTint="66"/>
+              <w:left w:val="single" w:sz="4" w:space="0" w:color="B8CCE4" w:themeColor="accent1" w:themeTint="66"/>
+              <w:bottom w:val="single" w:sz="4" w:space="0" w:color="B8CCE4" w:themeColor="accent1" w:themeTint="66"/>
+              <w:right w:val="single" w:sz="4" w:space="0" w:color="B8CCE4" w:themeColor="accent1" w:themeTint="66"/>
             </w:tcBorders>
             <w:tcMar>
               <w:top w:w="70" w:type="dxa"/>
@@ -2655,16 +2874,17 @@
       </w:tr>
       <w:tr>
         <w:trPr>
+          <w:trHeight w:val="303"/>
           <w:jc w:val="center"/>
         </w:trPr>
         <w:tc>
           <w:tcPr>
-            <w:tcW w:w="2300" w:type="dxa"/>
-            <w:tcBorders>
-              <w:top w:val="single" w:sz="4" w:space="0" w:color="C9D3E0"/>
-              <w:left w:val="single" w:sz="4" w:space="0" w:color="C9D3E0"/>
-              <w:bottom w:val="single" w:sz="4" w:space="0" w:color="C9D3E0"/>
-              <w:right w:val="single" w:sz="4" w:space="0" w:color="C9D3E0"/>
+            <w:tcW w:w="2403" w:type="dxa"/>
+            <w:tcBorders>
+              <w:top w:val="single" w:sz="4" w:space="0" w:color="B8CCE4" w:themeColor="accent1" w:themeTint="66"/>
+              <w:left w:val="single" w:sz="4" w:space="0" w:color="B8CCE4" w:themeColor="accent1" w:themeTint="66"/>
+              <w:bottom w:val="single" w:sz="4" w:space="0" w:color="B8CCE4" w:themeColor="accent1" w:themeTint="66"/>
+              <w:right w:val="single" w:sz="4" w:space="0" w:color="B8CCE4" w:themeColor="accent1" w:themeTint="66"/>
             </w:tcBorders>
             <w:tcMar>
               <w:top w:w="70" w:type="dxa"/>
@@ -2689,12 +2909,12 @@
         </w:tc>
         <w:tc>
           <w:tcPr>
-            <w:tcW w:w="4700" w:type="dxa"/>
-            <w:tcBorders>
-              <w:top w:val="single" w:sz="4" w:space="0" w:color="C9D3E0"/>
-              <w:left w:val="single" w:sz="4" w:space="0" w:color="C9D3E0"/>
-              <w:bottom w:val="single" w:sz="4" w:space="0" w:color="C9D3E0"/>
-              <w:right w:val="single" w:sz="4" w:space="0" w:color="C9D3E0"/>
+            <w:tcW w:w="4536" w:type="dxa"/>
+            <w:tcBorders>
+              <w:top w:val="single" w:sz="4" w:space="0" w:color="B8CCE4" w:themeColor="accent1" w:themeTint="66"/>
+              <w:left w:val="single" w:sz="4" w:space="0" w:color="B8CCE4" w:themeColor="accent1" w:themeTint="66"/>
+              <w:bottom w:val="single" w:sz="4" w:space="0" w:color="B8CCE4" w:themeColor="accent1" w:themeTint="66"/>
+              <w:right w:val="single" w:sz="4" w:space="0" w:color="B8CCE4" w:themeColor="accent1" w:themeTint="66"/>
             </w:tcBorders>
             <w:tcMar>
               <w:top w:w="70" w:type="dxa"/>
@@ -2718,35 +2938,49 @@
         </w:tc>
         <w:tc>
           <w:tcPr>
-            <w:tcW w:w="2000" w:type="dxa"/>
-            <w:tcBorders>
-              <w:top w:val="single" w:sz="4" w:space="0" w:color="C9D3E0"/>
-              <w:left w:val="single" w:sz="4" w:space="0" w:color="C9D3E0"/>
-              <w:bottom w:val="single" w:sz="4" w:space="0" w:color="C9D3E0"/>
-              <w:right w:val="single" w:sz="4" w:space="0" w:color="C9D3E0"/>
-            </w:tcBorders>
-            <w:tcMar>
-              <w:top w:w="70" w:type="dxa"/>
-              <w:left w:w="90" w:type="dxa"/>
-              <w:bottom w:w="70" w:type="dxa"/>
-              <w:right w:w="90" w:type="dxa"/>
-            </w:tcMar>
-            <w:vAlign w:val="center"/>
-          </w:tcPr>
-          <w:p>
-            <w:pPr>
-              <w:spacing w:after="0" w:line="247" w:lineRule="auto"/>
-            </w:pPr>
-          </w:p>
-        </w:tc>
-        <w:tc>
-          <w:tcPr>
-            <w:tcW w:w="1700" w:type="dxa"/>
-            <w:tcBorders>
-              <w:top w:val="single" w:sz="4" w:space="0" w:color="C9D3E0"/>
-              <w:left w:val="single" w:sz="4" w:space="0" w:color="C9D3E0"/>
-              <w:bottom w:val="single" w:sz="4" w:space="0" w:color="C9D3E0"/>
-              <w:right w:val="single" w:sz="4" w:space="0" w:color="C9D3E0"/>
+            <w:tcW w:w="567" w:type="dxa"/>
+            <w:tcBorders>
+              <w:left w:val="single" w:sz="4" w:space="0" w:color="B8CCE4" w:themeColor="accent1" w:themeTint="66"/>
+              <w:right w:val="single" w:sz="4" w:space="0" w:color="B8CCE4" w:themeColor="accent1" w:themeTint="66"/>
+            </w:tcBorders>
+          </w:tcPr>
+          <w:p>
+            <w:pPr>
+              <w:spacing w:after="0" w:line="247" w:lineRule="auto"/>
+            </w:pPr>
+          </w:p>
+        </w:tc>
+        <w:tc>
+          <w:tcPr>
+            <w:tcW w:w="2835" w:type="dxa"/>
+            <w:tcBorders>
+              <w:top w:val="single" w:sz="4" w:space="0" w:color="B8CCE4" w:themeColor="accent1" w:themeTint="66"/>
+              <w:left w:val="single" w:sz="4" w:space="0" w:color="B8CCE4" w:themeColor="accent1" w:themeTint="66"/>
+              <w:bottom w:val="single" w:sz="4" w:space="0" w:color="B8CCE4" w:themeColor="accent1" w:themeTint="66"/>
+              <w:right w:val="single" w:sz="4" w:space="0" w:color="B8CCE4" w:themeColor="accent1" w:themeTint="66"/>
+            </w:tcBorders>
+            <w:tcMar>
+              <w:top w:w="70" w:type="dxa"/>
+              <w:left w:w="90" w:type="dxa"/>
+              <w:bottom w:w="70" w:type="dxa"/>
+              <w:right w:w="90" w:type="dxa"/>
+            </w:tcMar>
+            <w:vAlign w:val="center"/>
+          </w:tcPr>
+          <w:p>
+            <w:pPr>
+              <w:spacing w:after="0" w:line="247" w:lineRule="auto"/>
+            </w:pPr>
+          </w:p>
+        </w:tc>
+        <w:tc>
+          <w:tcPr>
+            <w:tcW w:w="1417" w:type="dxa"/>
+            <w:tcBorders>
+              <w:top w:val="single" w:sz="4" w:space="0" w:color="B8CCE4" w:themeColor="accent1" w:themeTint="66"/>
+              <w:left w:val="single" w:sz="4" w:space="0" w:color="B8CCE4" w:themeColor="accent1" w:themeTint="66"/>
+              <w:bottom w:val="single" w:sz="4" w:space="0" w:color="B8CCE4" w:themeColor="accent1" w:themeTint="66"/>
+              <w:right w:val="single" w:sz="4" w:space="0" w:color="B8CCE4" w:themeColor="accent1" w:themeTint="66"/>
             </w:tcBorders>
             <w:tcMar>
               <w:top w:w="70" w:type="dxa"/>
@@ -2765,12 +2999,12 @@
         </w:tc>
         <w:tc>
           <w:tcPr>
-            <w:tcW w:w="4370" w:type="dxa"/>
-            <w:tcBorders>
-              <w:top w:val="single" w:sz="4" w:space="0" w:color="C9D3E0"/>
-              <w:left w:val="single" w:sz="4" w:space="0" w:color="C9D3E0"/>
-              <w:bottom w:val="single" w:sz="4" w:space="0" w:color="C9D3E0"/>
-              <w:right w:val="single" w:sz="4" w:space="0" w:color="C9D3E0"/>
+            <w:tcW w:w="3307" w:type="dxa"/>
+            <w:tcBorders>
+              <w:top w:val="single" w:sz="4" w:space="0" w:color="B8CCE4" w:themeColor="accent1" w:themeTint="66"/>
+              <w:left w:val="single" w:sz="4" w:space="0" w:color="B8CCE4" w:themeColor="accent1" w:themeTint="66"/>
+              <w:bottom w:val="single" w:sz="4" w:space="0" w:color="B8CCE4" w:themeColor="accent1" w:themeTint="66"/>
+              <w:right w:val="single" w:sz="4" w:space="0" w:color="B8CCE4" w:themeColor="accent1" w:themeTint="66"/>
             </w:tcBorders>
             <w:tcMar>
               <w:top w:w="70" w:type="dxa"/>
@@ -3829,7 +4063,6 @@
             <w:pPr>
               <w:spacing w:after="0" w:line="247" w:lineRule="auto"/>
               <w:rPr>
-                <w:rFonts w:hint="eastAsia"/>
                 <w:sz w:val="13"/>
                 <w:lang w:eastAsia="ko-KR"/>
               </w:rPr>
@@ -4544,7 +4777,6 @@
             <w:pPr>
               <w:spacing w:after="0" w:line="247" w:lineRule="auto"/>
               <w:rPr>
-                <w:rFonts w:hint="eastAsia"/>
                 <w:sz w:val="13"/>
                 <w:lang w:eastAsia="ko-KR"/>
               </w:rPr>
@@ -4786,7 +5018,6 @@
             <w:pPr>
               <w:spacing w:after="0" w:line="247" w:lineRule="auto"/>
               <w:rPr>
-                <w:rFonts w:hint="eastAsia"/>
                 <w:lang w:eastAsia="ko-KR"/>
               </w:rPr>
             </w:pPr>
@@ -4882,49 +5113,71 @@
             <w:pPr>
               <w:spacing w:after="0" w:line="247" w:lineRule="auto"/>
               <w:rPr>
+                <w:sz w:val="13"/>
+                <w:lang w:eastAsia="ko-KR"/>
+              </w:rPr>
+            </w:pPr>
+            <w:r>
+              <w:rPr>
+                <w:sz w:val="13"/>
+                <w:lang w:eastAsia="ko-KR"/>
+              </w:rPr>
+              <w:t>사업관리(</w:t>
+            </w:r>
+            <w:proofErr w:type="gramStart"/>
+            <w:r>
+              <w:rPr>
+                <w:sz w:val="13"/>
+                <w:lang w:eastAsia="ko-KR"/>
+              </w:rPr>
+              <w:t>일정관리,산출물관리</w:t>
+            </w:r>
+            <w:proofErr w:type="gramEnd"/>
+            <w:r>
+              <w:rPr>
+                <w:sz w:val="13"/>
+                <w:lang w:eastAsia="ko-KR"/>
+              </w:rPr>
+              <w:t>,</w:t>
+            </w:r>
+            <w:proofErr w:type="spellStart"/>
+            <w:r>
+              <w:rPr>
+                <w:sz w:val="13"/>
+                <w:lang w:eastAsia="ko-KR"/>
+              </w:rPr>
+              <w:t>인력관리등</w:t>
+            </w:r>
+            <w:proofErr w:type="spellEnd"/>
+            <w:r>
+              <w:rPr>
+                <w:sz w:val="13"/>
+                <w:lang w:eastAsia="ko-KR"/>
+              </w:rPr>
+              <w:t>)</w:t>
+            </w:r>
+            <w:r>
+              <w:rPr>
                 <w:rFonts w:hint="eastAsia"/>
                 <w:sz w:val="13"/>
                 <w:lang w:eastAsia="ko-KR"/>
               </w:rPr>
-            </w:pPr>
-            <w:r>
-              <w:rPr>
-                <w:sz w:val="13"/>
-                <w:lang w:eastAsia="ko-KR"/>
-              </w:rPr>
-              <w:t>사업관리(</w:t>
-            </w:r>
-            <w:proofErr w:type="gramStart"/>
-            <w:r>
-              <w:rPr>
-                <w:sz w:val="13"/>
-                <w:lang w:eastAsia="ko-KR"/>
-              </w:rPr>
-              <w:t>일정관리,산출물관리</w:t>
-            </w:r>
-            <w:proofErr w:type="gramEnd"/>
-            <w:r>
-              <w:rPr>
-                <w:sz w:val="13"/>
-                <w:lang w:eastAsia="ko-KR"/>
-              </w:rPr>
               <w:t>,</w:t>
             </w:r>
-            <w:proofErr w:type="spellStart"/>
-            <w:r>
-              <w:rPr>
-                <w:sz w:val="13"/>
-                <w:lang w:eastAsia="ko-KR"/>
-              </w:rPr>
-              <w:t>인력관리등</w:t>
-            </w:r>
-            <w:proofErr w:type="spellEnd"/>
-            <w:r>
-              <w:rPr>
-                <w:sz w:val="13"/>
-                <w:lang w:eastAsia="ko-KR"/>
-              </w:rPr>
-              <w:t>)</w:t>
+          </w:p>
+          <w:p>
+            <w:pPr>
+              <w:spacing w:after="0" w:line="247" w:lineRule="auto"/>
+              <w:rPr>
+                <w:lang w:eastAsia="ko-KR"/>
+              </w:rPr>
+            </w:pPr>
+            <w:r>
+              <w:rPr>
+                <w:sz w:val="13"/>
+                <w:lang w:eastAsia="ko-KR"/>
+              </w:rPr>
+              <w:t>전체 UI, UX 기획</w:t>
             </w:r>
             <w:r>
               <w:rPr>
@@ -4932,22 +5185,7 @@
                 <w:sz w:val="13"/>
                 <w:lang w:eastAsia="ko-KR"/>
               </w:rPr>
-              <w:t>,</w:t>
-            </w:r>
-          </w:p>
-          <w:p>
-            <w:pPr>
-              <w:spacing w:after="0" w:line="247" w:lineRule="auto"/>
-              <w:rPr>
-                <w:lang w:eastAsia="ko-KR"/>
-              </w:rPr>
-            </w:pPr>
-            <w:r>
-              <w:rPr>
-                <w:sz w:val="13"/>
-                <w:lang w:eastAsia="ko-KR"/>
-              </w:rPr>
-              <w:t>전체 UI, UX 기획</w:t>
+              <w:t>/디자인</w:t>
             </w:r>
             <w:r>
               <w:rPr>
@@ -4955,14 +5193,6 @@
                 <w:sz w:val="13"/>
                 <w:lang w:eastAsia="ko-KR"/>
               </w:rPr>
-              <w:t>/디자인</w:t>
-            </w:r>
-            <w:r>
-              <w:rPr>
-                <w:rFonts w:hint="eastAsia"/>
-                <w:sz w:val="13"/>
-                <w:lang w:eastAsia="ko-KR"/>
-              </w:rPr>
               <w:t xml:space="preserve">, </w:t>
             </w:r>
             <w:r>
@@ -4978,12 +5208,6 @@
                 <w:lang w:eastAsia="ko-KR"/>
               </w:rPr>
               <w:br/>
-            </w:r>
-            <w:r>
-              <w:rPr>
-                <w:sz w:val="13"/>
-                <w:lang w:eastAsia="ko-KR"/>
-              </w:rPr>
               <w:t xml:space="preserve">반응형 웹 </w:t>
             </w:r>
             <w:proofErr w:type="spellStart"/>
@@ -6644,8 +6868,30 @@
               <w:rPr>
                 <w:sz w:val="13"/>
               </w:rPr>
-              <w:t xml:space="preserve"> 및 운영 유지보수</w:t>
-            </w:r>
+              <w:t xml:space="preserve"> 및 </w:t>
+            </w:r>
+            <w:proofErr w:type="spellStart"/>
+            <w:r>
+              <w:rPr>
+                <w:sz w:val="13"/>
+              </w:rPr>
+              <w:t>운영</w:t>
+            </w:r>
+            <w:proofErr w:type="spellEnd"/>
+            <w:r>
+              <w:rPr>
+                <w:sz w:val="13"/>
+              </w:rPr>
+              <w:t xml:space="preserve"> </w:t>
+            </w:r>
+            <w:proofErr w:type="spellStart"/>
+            <w:r>
+              <w:rPr>
+                <w:sz w:val="13"/>
+              </w:rPr>
+              <w:t>유지보수</w:t>
+            </w:r>
+            <w:proofErr w:type="spellEnd"/>
           </w:p>
         </w:tc>
         <w:tc>
@@ -6804,7 +7050,6 @@
             <w:pPr>
               <w:spacing w:after="0" w:line="247" w:lineRule="auto"/>
               <w:rPr>
-                <w:rFonts w:hint="eastAsia"/>
                 <w:sz w:val="13"/>
                 <w:lang w:eastAsia="ko-KR"/>
               </w:rPr>
@@ -7180,7 +7425,6 @@
             <w:pPr>
               <w:spacing w:after="0" w:line="247" w:lineRule="auto"/>
               <w:rPr>
-                <w:rFonts w:hint="eastAsia"/>
                 <w:lang w:eastAsia="ko-KR"/>
               </w:rPr>
             </w:pPr>
@@ -7371,7 +7615,6 @@
             <w:pPr>
               <w:spacing w:after="0" w:line="247" w:lineRule="auto"/>
               <w:rPr>
-                <w:rFonts w:hint="eastAsia"/>
                 <w:sz w:val="13"/>
                 <w:lang w:eastAsia="ko-KR"/>
               </w:rPr>
@@ -7671,7 +7914,6 @@
             <w:pPr>
               <w:spacing w:after="0" w:line="247" w:lineRule="auto"/>
               <w:rPr>
-                <w:rFonts w:hint="eastAsia"/>
                 <w:sz w:val="13"/>
                 <w:lang w:eastAsia="ko-KR"/>
               </w:rPr>
@@ -7912,7 +8154,6 @@
             <w:pPr>
               <w:spacing w:after="0" w:line="247" w:lineRule="auto"/>
               <w:rPr>
-                <w:rFonts w:hint="eastAsia"/>
                 <w:lang w:eastAsia="ko-KR"/>
               </w:rPr>
             </w:pPr>
@@ -8000,7 +8241,6 @@
             <w:pPr>
               <w:spacing w:after="0" w:line="247" w:lineRule="auto"/>
               <w:rPr>
-                <w:rFonts w:hint="eastAsia"/>
                 <w:sz w:val="13"/>
                 <w:lang w:eastAsia="ko-KR"/>
               </w:rPr>
@@ -8299,7 +8539,6 @@
             <w:pPr>
               <w:spacing w:after="0" w:line="247" w:lineRule="auto"/>
               <w:rPr>
-                <w:rFonts w:hint="eastAsia"/>
                 <w:sz w:val="13"/>
                 <w:lang w:eastAsia="ko-KR"/>
               </w:rPr>
@@ -8600,7 +8839,6 @@
             <w:pPr>
               <w:spacing w:after="0" w:line="247" w:lineRule="auto"/>
               <w:rPr>
-                <w:rFonts w:hint="eastAsia"/>
                 <w:sz w:val="13"/>
                 <w:lang w:eastAsia="ko-KR"/>
               </w:rPr>
@@ -8892,64 +9130,62 @@
             <w:pPr>
               <w:spacing w:after="0" w:line="247" w:lineRule="auto"/>
               <w:rPr>
+                <w:sz w:val="13"/>
+                <w:lang w:eastAsia="ko-KR"/>
+              </w:rPr>
+            </w:pPr>
+            <w:r>
+              <w:rPr>
+                <w:sz w:val="13"/>
+                <w:lang w:eastAsia="ko-KR"/>
+              </w:rPr>
+              <w:t>사업관리(</w:t>
+            </w:r>
+            <w:proofErr w:type="gramStart"/>
+            <w:r>
+              <w:rPr>
+                <w:sz w:val="13"/>
+                <w:lang w:eastAsia="ko-KR"/>
+              </w:rPr>
+              <w:t>일정관리,산출물관리</w:t>
+            </w:r>
+            <w:proofErr w:type="gramEnd"/>
+            <w:r>
+              <w:rPr>
+                <w:sz w:val="13"/>
+                <w:lang w:eastAsia="ko-KR"/>
+              </w:rPr>
+              <w:t>,</w:t>
+            </w:r>
+            <w:proofErr w:type="spellStart"/>
+            <w:r>
+              <w:rPr>
+                <w:sz w:val="13"/>
+                <w:lang w:eastAsia="ko-KR"/>
+              </w:rPr>
+              <w:t>인력관리등</w:t>
+            </w:r>
+            <w:proofErr w:type="spellEnd"/>
+            <w:r>
+              <w:rPr>
+                <w:sz w:val="13"/>
+                <w:lang w:eastAsia="ko-KR"/>
+              </w:rPr>
+              <w:t>)</w:t>
+            </w:r>
+            <w:r>
+              <w:rPr>
                 <w:rFonts w:hint="eastAsia"/>
                 <w:sz w:val="13"/>
                 <w:lang w:eastAsia="ko-KR"/>
               </w:rPr>
-            </w:pPr>
-            <w:r>
-              <w:rPr>
-                <w:sz w:val="13"/>
-                <w:lang w:eastAsia="ko-KR"/>
-              </w:rPr>
-              <w:t>사업관리(</w:t>
-            </w:r>
-            <w:proofErr w:type="gramStart"/>
-            <w:r>
-              <w:rPr>
-                <w:sz w:val="13"/>
-                <w:lang w:eastAsia="ko-KR"/>
-              </w:rPr>
-              <w:t>일정관리,산출물관리</w:t>
-            </w:r>
-            <w:proofErr w:type="gramEnd"/>
-            <w:r>
-              <w:rPr>
-                <w:sz w:val="13"/>
-                <w:lang w:eastAsia="ko-KR"/>
-              </w:rPr>
               <w:t>,</w:t>
             </w:r>
-            <w:proofErr w:type="spellStart"/>
-            <w:r>
-              <w:rPr>
-                <w:sz w:val="13"/>
-                <w:lang w:eastAsia="ko-KR"/>
-              </w:rPr>
-              <w:t>인력관리등</w:t>
-            </w:r>
-            <w:proofErr w:type="spellEnd"/>
-            <w:r>
-              <w:rPr>
-                <w:sz w:val="13"/>
-                <w:lang w:eastAsia="ko-KR"/>
-              </w:rPr>
-              <w:t>)</w:t>
-            </w:r>
-            <w:r>
-              <w:rPr>
-                <w:rFonts w:hint="eastAsia"/>
-                <w:sz w:val="13"/>
-                <w:lang w:eastAsia="ko-KR"/>
-              </w:rPr>
-              <w:t>,</w:t>
-            </w:r>
-          </w:p>
-          <w:p>
-            <w:pPr>
-              <w:spacing w:after="0" w:line="247" w:lineRule="auto"/>
-              <w:rPr>
-                <w:rFonts w:hint="eastAsia"/>
+          </w:p>
+          <w:p>
+            <w:pPr>
+              <w:spacing w:after="0" w:line="247" w:lineRule="auto"/>
+              <w:rPr>
                 <w:lang w:eastAsia="ko-KR"/>
               </w:rPr>
             </w:pPr>
@@ -9231,7 +9467,6 @@
             <w:pPr>
               <w:spacing w:after="0" w:line="247" w:lineRule="auto"/>
               <w:rPr>
-                <w:rFonts w:hint="eastAsia"/>
                 <w:sz w:val="13"/>
                 <w:lang w:eastAsia="ko-KR"/>
               </w:rPr>
@@ -9569,7 +9804,6 @@
             <w:pPr>
               <w:spacing w:after="0" w:line="247" w:lineRule="auto"/>
               <w:rPr>
-                <w:rFonts w:hint="eastAsia"/>
                 <w:sz w:val="13"/>
                 <w:lang w:eastAsia="ko-KR"/>
               </w:rPr>
@@ -9868,7 +10102,6 @@
             <w:pPr>
               <w:spacing w:after="0" w:line="247" w:lineRule="auto"/>
               <w:rPr>
-                <w:rFonts w:hint="eastAsia"/>
                 <w:sz w:val="13"/>
                 <w:lang w:eastAsia="ko-KR"/>
               </w:rPr>
@@ -10190,7 +10423,6 @@
             <w:pPr>
               <w:spacing w:after="0" w:line="247" w:lineRule="auto"/>
               <w:rPr>
-                <w:rFonts w:hint="eastAsia"/>
                 <w:sz w:val="13"/>
                 <w:lang w:eastAsia="ko-KR"/>
               </w:rPr>
@@ -10514,7 +10746,6 @@
             <w:pPr>
               <w:spacing w:after="0" w:line="247" w:lineRule="auto"/>
               <w:rPr>
-                <w:rFonts w:hint="eastAsia"/>
                 <w:sz w:val="13"/>
                 <w:lang w:eastAsia="ko-KR"/>
               </w:rPr>
@@ -10813,7 +11044,6 @@
             <w:pPr>
               <w:spacing w:after="0" w:line="247" w:lineRule="auto"/>
               <w:rPr>
-                <w:rFonts w:hint="eastAsia"/>
                 <w:sz w:val="13"/>
                 <w:lang w:eastAsia="ko-KR"/>
               </w:rPr>
@@ -11118,7 +11348,6 @@
             <w:pPr>
               <w:spacing w:after="0" w:line="247" w:lineRule="auto"/>
               <w:rPr>
-                <w:rFonts w:hint="eastAsia"/>
                 <w:sz w:val="13"/>
                 <w:lang w:eastAsia="ko-KR"/>
               </w:rPr>
@@ -11417,7 +11646,6 @@
             <w:pPr>
               <w:spacing w:after="0" w:line="247" w:lineRule="auto"/>
               <w:rPr>
-                <w:rFonts w:hint="eastAsia"/>
                 <w:sz w:val="13"/>
                 <w:lang w:eastAsia="ko-KR"/>
               </w:rPr>
@@ -11536,7 +11764,7 @@
       </w:r>
     </w:p>
     <w:sectPr>
-      <w:headerReference w:type="default" r:id="rId9"/>
+      <w:headerReference w:type="default" r:id="rId10"/>
       <w:pgSz w:w="16838" w:h="11906" w:orient="landscape"/>
       <w:pgMar w:top="567" w:right="595" w:bottom="482" w:left="595" w:header="227" w:footer="198" w:gutter="0"/>
       <w:cols w:space="720"/>
@@ -12442,6 +12670,7 @@
   <w:style w:type="character" w:default="1" w:styleId="a2">
     <w:name w:val="Default Paragraph Font"/>
     <w:uiPriority w:val="1"/>
+    <w:semiHidden/>
     <w:unhideWhenUsed/>
   </w:style>
   <w:style w:type="table" w:default="1" w:styleId="a3">
@@ -23219,6 +23448,29 @@
       </w:tcPr>
     </w:tblStylePr>
   </w:style>
+  <w:style w:type="character" w:styleId="aff1">
+    <w:name w:val="Hyperlink"/>
+    <w:basedOn w:val="a2"/>
+    <w:uiPriority w:val="99"/>
+    <w:unhideWhenUsed/>
+    <w:rsid w:val="004133B3"/>
+    <w:rPr>
+      <w:color w:val="0000FF" w:themeColor="hyperlink"/>
+      <w:u w:val="single"/>
+    </w:rPr>
+  </w:style>
+  <w:style w:type="character" w:styleId="aff2">
+    <w:name w:val="Unresolved Mention"/>
+    <w:basedOn w:val="a2"/>
+    <w:uiPriority w:val="99"/>
+    <w:semiHidden/>
+    <w:unhideWhenUsed/>
+    <w:rsid w:val="004133B3"/>
+    <w:rPr>
+      <w:color w:val="605E5C"/>
+      <w:shd w:val="clear" w:color="auto" w:fill="E1DFDD"/>
+    </w:rPr>
+  </w:style>
 </w:styles>
 </file>
 

</xml_diff>